<commit_message>
Restore online copy table numbers
</commit_message>
<xml_diff>
--- a/When_Perfect_Is_Wrong_Online_Copy.docx
+++ b/When_Perfect_Is_Wrong_Online_Copy.docx
@@ -100,7 +100,7 @@
     </w:p>
     <w:p>
       <w:r>
-        <w:t xml:space="preserve">Table. Summary of datasets used in this study ((L. J. Rubini, P. Soundarapandian, and P. Eswaran. Chronic kidney disease. UCI Machine Learning Repository, 2015, DOI: https://doi.org/10.24432/C5G020.)), ((Centers for Disease Control and Prevention, National Center for Health Statistics. NHANES August 2021–August 2023 questionnaires, datasets, and related documentation. 2024, URL: https://wwwn.cdc.gov/nchs/nhanes/continuousnhanes/default.aspx?Cycle=2021-2023.)), ((S. Al-Shamsi, D. Regmi, and R. D. Govender. Chronic kidney disease in patients at high risk of cardiovascular disease in the United Arab Emirates: a population-based study. PLOS ONE. Vol. 13, No. 6, article e0199920, 2018, DOI: https://doi.org/10.1371/journal.pone.0199920.)).</w:t>
+        <w:t xml:space="preserve">Table 1. Summary of datasets used in this study ((L. J. Rubini, P. Soundarapandian, and P. Eswaran. Chronic kidney disease. UCI Machine Learning Repository, 2015, DOI: https://doi.org/10.24432/C5G020.)), ((Centers for Disease Control and Prevention, National Center for Health Statistics. NHANES August 2021–August 2023 questionnaires, datasets, and related documentation. 2024, URL: https://wwwn.cdc.gov/nchs/nhanes/continuousnhanes/default.aspx?Cycle=2021-2023.)), ((S. Al-Shamsi, D. Regmi, and R. D. Govender. Chronic kidney disease in patients at high risk of cardiovascular disease in the United Arab Emirates: a population-based study. PLOS ONE. Vol. 13, No. 6, article e0199920, 2018, DOI: https://doi.org/10.1371/journal.pone.0199920.)).</w:t>
       </w:r>
     </w:p>
     <w:tbl>
@@ -325,7 +325,7 @@
     </w:tbl>
     <w:p>
       <w:r>
-        <w:t xml:space="preserve">Table. Mapping of dataset labels to KDIGO 2024 CKD stages ((KDIGO CKD Work Group. KDIGO 2024 clinical practice guideline for the evaluation and management of chronic kidney disease. Kidney International. Vol. 105, No. 4S, pg. S117–S314, 2024, DOI: https://doi.org/10.1016/j.kint.2023.10.018.)).</w:t>
+        <w:t xml:space="preserve">Table 2. Mapping of dataset labels to KDIGO 2024 CKD stages ((KDIGO CKD Work Group. KDIGO 2024 clinical practice guideline for the evaluation and management of chronic kidney disease. Kidney International. Vol. 105, No. 4S, pg. S117–S314, 2024, DOI: https://doi.org/10.1016/j.kint.2023.10.018.)).</w:t>
       </w:r>
     </w:p>
     <w:tbl>
@@ -510,7 +510,7 @@
     </w:tbl>
     <w:p>
       <w:r>
-        <w:t xml:space="preserve">Table. Dataset audit from the regenerated pipeline. Predictor missingness is counted before train-only imputation.</w:t>
+        <w:t xml:space="preserve">Table 3. Dataset audit from the regenerated pipeline. Predictor missingness is counted before train-only imputation.</w:t>
       </w:r>
     </w:p>
     <w:tbl>
@@ -1014,7 +1014,7 @@
     </w:p>
     <w:p>
       <w:r>
-        <w:t xml:space="preserve">Table. Machine-learning models evaluated in the revised pipeline.</w:t>
+        <w:t xml:space="preserve">Table 4. Machine-learning models evaluated in the revised pipeline.</w:t>
       </w:r>
     </w:p>
     <w:tbl>
@@ -1327,7 +1327,7 @@
     </w:p>
     <w:p>
       <w:r>
-        <w:t xml:space="preserve">Table. Held-out test-set performance for the revised pipeline.</w:t>
+        <w:t xml:space="preserve">Table 5. Held-out test-set performance for the revised pipeline.</w:t>
       </w:r>
     </w:p>
     <w:tbl>
@@ -1724,7 +1724,7 @@
     </w:p>
     <w:p>
       <w:r>
-        <w:t xml:space="preserve">Table. Threshold 0.5 sensitivity and specificity for NHANES and Tawam.</w:t>
+        <w:t xml:space="preserve">Table 6. Threshold 0.5 sensitivity and specificity for NHANES and Tawam.</w:t>
       </w:r>
     </w:p>
     <w:tbl>
@@ -2240,7 +2240,7 @@
     </w:p>
     <w:p>
       <w:r>
-        <w:t xml:space="preserve">Table. NHANES full-data AUC depends strongly on whether label-defining variables are included.</w:t>
+        <w:t xml:space="preserve">Table 7. NHANES full-data AUC depends strongly on whether label-defining variables are included.</w:t>
       </w:r>
     </w:p>
     <w:tbl>
@@ -2612,7 +2612,7 @@
     </w:p>
     <w:p>
       <w:r>
-        <w:t xml:space="preserve">Table. NHANES power-law fit summaries. Values for c, a, and b are estimate (95% bootstrap CI). Drop–2 c is the ceiling refit after excluding the two smallest training sizes.</w:t>
+        <w:t xml:space="preserve">Table 8. NHANES power-law fit summaries. Values for c, a, and b are estimate (95% bootstrap CI). Drop–2 c is the ceiling refit after excluding the two smallest training sizes.</w:t>
       </w:r>
     </w:p>
     <w:tbl>

</xml_diff>